<commit_message>
chore: update template_2 and template_3 docx files
</commit_message>
<xml_diff>
--- a/backend/template/template_2.docx
+++ b/backend/template/template_2.docx
@@ -226,15 +226,15 @@
           <w:b/>
           <w:bCs/>
         </w:rPr>
+        <w:t>{% if LINKEDIN %}</w:t>
+      </w:r>
+      <w:r>
+        <w:rPr>
+          <w:b/>
+          <w:bCs/>
+        </w:rPr>
         <w:br/>
-        <w:t xml:space="preserve">LinkedIn: </w:t>
-      </w:r>
-      <w:r>
-        <w:rPr>
-          <w:b/>
-          <w:bCs/>
-        </w:rPr>
-        <w:t>{{LINKEDIN}}</w:t>
+        <w:t>LinkedIn: {{LINKEDIN}}{% endif %}</w:t>
       </w:r>
     </w:p>
     <w:p>
@@ -344,7 +344,6 @@
           <w:sz w:val="22"/>
         </w:rPr>
       </w:pPr>
-      <w:proofErr w:type="gramStart"/>
       <w:r>
         <w:rPr>
           <w:sz w:val="21"/>
@@ -359,45 +358,12 @@
         </w:rPr>
         <w:t>sum</w:t>
       </w:r>
-      <w:proofErr w:type="gramEnd"/>
       <w:r>
         <w:rPr>
           <w:sz w:val="21"/>
           <w:szCs w:val="21"/>
         </w:rPr>
-        <w:t xml:space="preserve"> </w:t>
-      </w:r>
-      <w:proofErr w:type="gramStart"/>
-      <w:r>
-        <w:rPr>
-          <w:sz w:val="21"/>
-          <w:szCs w:val="21"/>
-        </w:rPr>
-        <w:t>}}{</w:t>
-      </w:r>
-      <w:proofErr w:type="gramEnd"/>
-      <w:r>
-        <w:rPr>
-          <w:sz w:val="21"/>
-          <w:szCs w:val="21"/>
-        </w:rPr>
-        <w:t xml:space="preserve">% </w:t>
-      </w:r>
-      <w:proofErr w:type="spellStart"/>
-      <w:r>
-        <w:rPr>
-          <w:sz w:val="21"/>
-          <w:szCs w:val="21"/>
-        </w:rPr>
-        <w:t>endfor</w:t>
-      </w:r>
-      <w:proofErr w:type="spellEnd"/>
-      <w:r>
-        <w:rPr>
-          <w:sz w:val="21"/>
-          <w:szCs w:val="21"/>
-        </w:rPr>
-        <w:t xml:space="preserve"> %}</w:t>
+        <w:t xml:space="preserve"> }}{% endfor %}</w:t>
       </w:r>
     </w:p>
     <w:p>
@@ -497,14 +463,7 @@
                 <w:rFonts w:eastAsia="Times New Roman" w:cstheme="minorHAnsi"/>
                 <w:lang w:val="en-US"/>
               </w:rPr>
-              <w:t>{%tr for skill in SKILLS %</w:t>
-            </w:r>
-            <w:r>
-              <w:rPr>
-                <w:rFonts w:eastAsia="Times New Roman" w:cstheme="minorHAnsi"/>
-                <w:lang w:val="en-US"/>
-              </w:rPr>
-              <w:t>}</w:t>
+              <w:t>{%tr for skill in SKILLS %}</w:t>
             </w:r>
           </w:p>
         </w:tc>
@@ -536,7 +495,6 @@
                 <w:bCs/>
               </w:rPr>
             </w:pPr>
-            <w:proofErr w:type="gramStart"/>
             <w:r>
               <w:rPr>
                 <w:rFonts w:eastAsia="Times New Roman" w:cstheme="minorHAnsi"/>
@@ -544,37 +502,7 @@
                 <w:bCs/>
                 <w:lang w:val="en-US"/>
               </w:rPr>
-              <w:t xml:space="preserve">{{ </w:t>
-            </w:r>
-            <w:proofErr w:type="spellStart"/>
-            <w:r>
-              <w:rPr>
-                <w:rFonts w:eastAsia="Times New Roman" w:cstheme="minorHAnsi"/>
-                <w:b/>
-                <w:bCs/>
-                <w:lang w:val="en-US"/>
-              </w:rPr>
-              <w:t>skill</w:t>
-            </w:r>
-            <w:proofErr w:type="gramEnd"/>
-            <w:r>
-              <w:rPr>
-                <w:rFonts w:eastAsia="Times New Roman" w:cstheme="minorHAnsi"/>
-                <w:b/>
-                <w:bCs/>
-                <w:lang w:val="en-US"/>
-              </w:rPr>
-              <w:t>.SKILL_NAME</w:t>
-            </w:r>
-            <w:proofErr w:type="spellEnd"/>
-            <w:r>
-              <w:rPr>
-                <w:rFonts w:eastAsia="Times New Roman" w:cstheme="minorHAnsi"/>
-                <w:b/>
-                <w:bCs/>
-                <w:lang w:val="en-US"/>
-              </w:rPr>
-              <w:t xml:space="preserve"> }}</w:t>
+              <w:t>{{ skill.SKILL_NAME }}</w:t>
             </w:r>
           </w:p>
         </w:tc>
@@ -590,53 +518,12 @@
                 <w:lang w:val="en-US"/>
               </w:rPr>
             </w:pPr>
-            <w:proofErr w:type="gramStart"/>
             <w:r>
               <w:rPr>
                 <w:rFonts w:eastAsia="Times New Roman" w:cstheme="minorHAnsi"/>
                 <w:lang w:val="en-US"/>
               </w:rPr>
-              <w:t xml:space="preserve">{{ </w:t>
-            </w:r>
-            <w:proofErr w:type="spellStart"/>
-            <w:r>
-              <w:rPr>
-                <w:rFonts w:eastAsia="Times New Roman" w:cstheme="minorHAnsi"/>
-                <w:lang w:val="en-US"/>
-              </w:rPr>
-              <w:t>skill</w:t>
-            </w:r>
-            <w:proofErr w:type="gramEnd"/>
-            <w:r>
-              <w:rPr>
-                <w:rFonts w:eastAsia="Times New Roman" w:cstheme="minorHAnsi"/>
-                <w:lang w:val="en-US"/>
-              </w:rPr>
-              <w:t>.</w:t>
-            </w:r>
-            <w:proofErr w:type="gramStart"/>
-            <w:r>
-              <w:rPr>
-                <w:rFonts w:eastAsia="Times New Roman" w:cstheme="minorHAnsi"/>
-                <w:lang w:val="en-US"/>
-              </w:rPr>
-              <w:t>SKILLS</w:t>
-            </w:r>
-            <w:proofErr w:type="spellEnd"/>
-            <w:r>
-              <w:rPr>
-                <w:rFonts w:eastAsia="Times New Roman" w:cstheme="minorHAnsi"/>
-                <w:lang w:val="en-US"/>
-              </w:rPr>
-              <w:t xml:space="preserve"> }</w:t>
-            </w:r>
-            <w:proofErr w:type="gramEnd"/>
-            <w:r>
-              <w:rPr>
-                <w:rFonts w:eastAsia="Times New Roman" w:cstheme="minorHAnsi"/>
-                <w:lang w:val="en-US"/>
-              </w:rPr>
-              <w:t>}</w:t>
+              <w:t>{{ skill.SKILLS }}</w:t>
             </w:r>
           </w:p>
           <w:p>
@@ -675,23 +562,7 @@
                 <w:rFonts w:eastAsia="Times New Roman" w:cstheme="minorHAnsi"/>
                 <w:lang w:val="en-US"/>
               </w:rPr>
-              <w:t xml:space="preserve">%tr </w:t>
-            </w:r>
-            <w:proofErr w:type="spellStart"/>
-            <w:r>
-              <w:rPr>
-                <w:rFonts w:eastAsia="Times New Roman" w:cstheme="minorHAnsi"/>
-                <w:lang w:val="en-US"/>
-              </w:rPr>
-              <w:t>endfor</w:t>
-            </w:r>
-            <w:proofErr w:type="spellEnd"/>
-            <w:r>
-              <w:rPr>
-                <w:rFonts w:eastAsia="Times New Roman" w:cstheme="minorHAnsi"/>
-                <w:lang w:val="en-US"/>
-              </w:rPr>
-              <w:t xml:space="preserve"> %}</w:t>
+              <w:t>%tr endfor %}</w:t>
             </w:r>
           </w:p>
         </w:tc>
@@ -724,6 +595,9 @@
     </w:p>
     <w:p>
       <w:pPr>
+        <w:tabs>
+          <w:tab w:val="right" w:pos="10800"/>
+        </w:tabs>
         <w:spacing w:after="0" w:line="240" w:lineRule="auto"/>
         <w:ind w:left="180" w:right="-270" w:hanging="540"/>
         <w:rPr>
@@ -798,6 +672,60 @@
     </w:p>
     <w:p>
       <w:pPr>
+        <w:tabs>
+          <w:tab w:val="right" w:pos="10800"/>
+        </w:tabs>
+        <w:spacing w:after="0" w:line="240" w:lineRule="auto"/>
+        <w:ind w:left="187" w:right="-274" w:hanging="547"/>
+        <w:rPr>
+          <w:b/>
+          <w:bCs/>
+          <w:sz w:val="21"/>
+          <w:szCs w:val="21"/>
+        </w:rPr>
+      </w:pPr>
+      <w:r>
+        <w:rPr>
+          <w:b/>
+          <w:bCs/>
+          <w:sz w:val="21"/>
+          <w:szCs w:val="21"/>
+        </w:rPr>
+        <w:t xml:space="preserve">Client: </w:t>
+      </w:r>
+      <w:r>
+        <w:rPr>
+          <w:b/>
+          <w:bCs/>
+          <w:sz w:val="21"/>
+          <w:szCs w:val="21"/>
+        </w:rPr>
+        <w:t>{{ exp.client }}</w:t>
+      </w:r>
+      <w:r>
+        <w:rPr>
+          <w:b/>
+          <w:bCs/>
+          <w:sz w:val="21"/>
+          <w:szCs w:val="21"/>
+        </w:rPr>
+        <w:tab/>
+      </w:r>
+      <w:r>
+        <w:rPr>
+          <w:b/>
+          <w:bCs/>
+          <w:sz w:val="21"/>
+          <w:szCs w:val="21"/>
+        </w:rPr>
+        <w:t>{{ exp.timeline }}</w:t>
+      </w:r>
+    </w:p>
+    <w:p>
+      <w:pPr>
+        <w:tabs>
+          <w:tab w:val="right" w:pos="10800"/>
+        </w:tabs>
         <w:spacing w:after="0" w:line="240" w:lineRule="auto"/>
         <w:ind w:left="180" w:right="-270" w:hanging="540"/>
         <w:rPr>
@@ -807,7 +735,6 @@
           <w:szCs w:val="21"/>
         </w:rPr>
       </w:pPr>
-      <w:proofErr w:type="gramStart"/>
       <w:r>
         <w:rPr>
           <w:b/>
@@ -815,198 +742,30 @@
           <w:sz w:val="21"/>
           <w:szCs w:val="21"/>
         </w:rPr>
-        <w:t xml:space="preserve">{{ </w:t>
-      </w:r>
-      <w:proofErr w:type="spellStart"/>
-      <w:r>
-        <w:rPr>
-          <w:b/>
-          <w:bCs/>
+        <w:t xml:space="preserve">Role: </w:t>
+      </w:r>
+      <w:r>
+        <w:rPr>
           <w:sz w:val="21"/>
           <w:szCs w:val="21"/>
         </w:rPr>
-        <w:t>exp</w:t>
-      </w:r>
-      <w:proofErr w:type="gramEnd"/>
-      <w:r>
-        <w:rPr>
-          <w:b/>
-          <w:bCs/>
-          <w:sz w:val="21"/>
-          <w:szCs w:val="21"/>
-        </w:rPr>
-        <w:t>.</w:t>
-      </w:r>
-      <w:proofErr w:type="gramStart"/>
-      <w:r>
-        <w:rPr>
-          <w:b/>
-          <w:bCs/>
-          <w:sz w:val="21"/>
-          <w:szCs w:val="21"/>
-        </w:rPr>
-        <w:t>client</w:t>
-      </w:r>
-      <w:proofErr w:type="spellEnd"/>
-      <w:r>
-        <w:rPr>
-          <w:b/>
-          <w:bCs/>
-          <w:sz w:val="21"/>
-          <w:szCs w:val="21"/>
-        </w:rPr>
-        <w:t xml:space="preserve"> }}</w:t>
-      </w:r>
-      <w:r>
-        <w:rPr>
-          <w:b/>
-          <w:bCs/>
-          <w:sz w:val="21"/>
-          <w:szCs w:val="21"/>
-        </w:rPr>
-        <w:tab/>
-      </w:r>
-      <w:r>
-        <w:rPr>
-          <w:b/>
-          <w:bCs/>
-          <w:sz w:val="21"/>
-          <w:szCs w:val="21"/>
-        </w:rPr>
-        <w:t xml:space="preserve">{{ </w:t>
-      </w:r>
-      <w:proofErr w:type="spellStart"/>
-      <w:r>
-        <w:rPr>
-          <w:b/>
-          <w:bCs/>
-          <w:sz w:val="21"/>
-          <w:szCs w:val="21"/>
-        </w:rPr>
-        <w:t>exp</w:t>
-      </w:r>
-      <w:proofErr w:type="gramEnd"/>
-      <w:r>
-        <w:rPr>
-          <w:b/>
-          <w:bCs/>
-          <w:sz w:val="21"/>
-          <w:szCs w:val="21"/>
-        </w:rPr>
-        <w:t>.</w:t>
-      </w:r>
-      <w:proofErr w:type="gramStart"/>
-      <w:r>
-        <w:rPr>
-          <w:b/>
-          <w:bCs/>
-          <w:sz w:val="21"/>
-          <w:szCs w:val="21"/>
-        </w:rPr>
-        <w:t>timeline</w:t>
-      </w:r>
-      <w:proofErr w:type="spellEnd"/>
-      <w:r>
-        <w:rPr>
-          <w:b/>
-          <w:bCs/>
-          <w:sz w:val="21"/>
-          <w:szCs w:val="21"/>
-        </w:rPr>
-        <w:t xml:space="preserve"> }</w:t>
-      </w:r>
-      <w:proofErr w:type="gramEnd"/>
-      <w:r>
-        <w:rPr>
-          <w:b/>
-          <w:bCs/>
-          <w:sz w:val="21"/>
-          <w:szCs w:val="21"/>
-        </w:rPr>
-        <w:t>}</w:t>
+        <w:t>{{ exp.role }}</w:t>
       </w:r>
     </w:p>
     <w:p>
       <w:pPr>
+        <w:tabs>
+          <w:tab w:val="right" w:pos="10800"/>
+        </w:tabs>
         <w:spacing w:after="0" w:line="240" w:lineRule="auto"/>
         <w:ind w:left="180" w:right="-270" w:hanging="540"/>
         <w:rPr>
-          <w:b/>
-          <w:bCs/>
-          <w:sz w:val="21"/>
-          <w:szCs w:val="21"/>
-        </w:rPr>
-      </w:pPr>
-      <w:r>
-        <w:rPr>
-          <w:b/>
-          <w:bCs/>
-          <w:sz w:val="21"/>
-          <w:szCs w:val="21"/>
-        </w:rPr>
-        <w:t xml:space="preserve">Role: </w:t>
-      </w:r>
-      <w:proofErr w:type="gramStart"/>
-      <w:r>
-        <w:rPr>
-          <w:sz w:val="21"/>
-          <w:szCs w:val="21"/>
-        </w:rPr>
-        <w:t xml:space="preserve">{{ </w:t>
-      </w:r>
-      <w:proofErr w:type="spellStart"/>
-      <w:r>
-        <w:rPr>
-          <w:sz w:val="21"/>
-          <w:szCs w:val="21"/>
-        </w:rPr>
-        <w:t>exp</w:t>
-      </w:r>
-      <w:proofErr w:type="gramEnd"/>
-      <w:r>
-        <w:rPr>
-          <w:sz w:val="21"/>
-          <w:szCs w:val="21"/>
-        </w:rPr>
-        <w:t>.</w:t>
-      </w:r>
-      <w:proofErr w:type="gramStart"/>
-      <w:r>
-        <w:rPr>
-          <w:sz w:val="21"/>
-          <w:szCs w:val="21"/>
-        </w:rPr>
-        <w:t>role</w:t>
-      </w:r>
-      <w:proofErr w:type="spellEnd"/>
-      <w:r>
-        <w:rPr>
-          <w:sz w:val="21"/>
-          <w:szCs w:val="21"/>
-        </w:rPr>
-        <w:t xml:space="preserve"> }</w:t>
-      </w:r>
-      <w:proofErr w:type="gramEnd"/>
-      <w:r>
-        <w:rPr>
-          <w:sz w:val="21"/>
-          <w:szCs w:val="21"/>
-        </w:rPr>
-        <w:t>}</w:t>
-      </w:r>
-    </w:p>
-    <w:p>
-      <w:pPr>
-        <w:spacing w:after="0" w:line="240" w:lineRule="auto"/>
-        <w:ind w:left="180" w:right="-270" w:hanging="540"/>
-        <w:rPr>
           <w:rFonts w:eastAsia="Times New Roman" w:cstheme="minorHAnsi"/>
           <w:b/>
           <w:bCs/>
           <w:sz w:val="22"/>
         </w:rPr>
       </w:pPr>
-      <w:proofErr w:type="gramStart"/>
       <w:r>
         <w:rPr>
           <w:b/>
@@ -1031,33 +790,7 @@
           <w:sz w:val="21"/>
           <w:szCs w:val="21"/>
         </w:rPr>
-        <w:t>{</w:t>
-      </w:r>
-      <w:proofErr w:type="gramEnd"/>
-      <w:r>
-        <w:rPr>
-          <w:sz w:val="21"/>
-          <w:szCs w:val="21"/>
-        </w:rPr>
-        <w:t xml:space="preserve">% for b in </w:t>
-      </w:r>
-      <w:proofErr w:type="spellStart"/>
-      <w:proofErr w:type="gramStart"/>
-      <w:r>
-        <w:rPr>
-          <w:sz w:val="21"/>
-          <w:szCs w:val="21"/>
-        </w:rPr>
-        <w:t>exp.responsibilities</w:t>
-      </w:r>
-      <w:proofErr w:type="spellEnd"/>
-      <w:proofErr w:type="gramEnd"/>
-      <w:r>
-        <w:rPr>
-          <w:sz w:val="21"/>
-          <w:szCs w:val="21"/>
-        </w:rPr>
-        <w:t xml:space="preserve"> %}</w:t>
+        <w:t>{% for b in exp.responsibilities %}</w:t>
       </w:r>
     </w:p>
     <w:p>
@@ -1067,6 +800,9 @@
           <w:ilvl w:val="0"/>
           <w:numId w:val="8"/>
         </w:numPr>
+        <w:tabs>
+          <w:tab w:val="right" w:pos="10800"/>
+        </w:tabs>
         <w:spacing w:after="0" w:line="240" w:lineRule="auto"/>
         <w:ind w:left="0"/>
         <w:rPr>
@@ -1076,155 +812,63 @@
           <w:sz w:val="22"/>
         </w:rPr>
       </w:pPr>
-      <w:proofErr w:type="gramStart"/>
       <w:r>
         <w:rPr>
           <w:sz w:val="21"/>
           <w:szCs w:val="21"/>
         </w:rPr>
-        <w:t>{{ b</w:t>
-      </w:r>
-      <w:proofErr w:type="gramEnd"/>
-      <w:r>
+        <w:t>{{ b }}{% endfor %}</w:t>
+      </w:r>
+    </w:p>
+    <w:p>
+      <w:pPr>
+        <w:tabs>
+          <w:tab w:val="right" w:pos="10800"/>
+        </w:tabs>
+        <w:spacing w:after="0" w:line="240" w:lineRule="auto"/>
+        <w:ind w:left="180" w:right="-270" w:hanging="540"/>
         <w:rPr>
           <w:sz w:val="21"/>
           <w:szCs w:val="21"/>
         </w:rPr>
-        <w:t xml:space="preserve"> </w:t>
-      </w:r>
-      <w:proofErr w:type="gramStart"/>
-      <w:r>
-        <w:rPr>
+      </w:pPr>
+      <w:r>
+        <w:rPr>
+          <w:b/>
+          <w:bCs/>
           <w:sz w:val="21"/>
           <w:szCs w:val="21"/>
         </w:rPr>
-        <w:t>}}{</w:t>
-      </w:r>
-      <w:proofErr w:type="gramEnd"/>
+        <w:t xml:space="preserve">Environment: </w:t>
+      </w:r>
       <w:r>
         <w:rPr>
           <w:sz w:val="21"/>
           <w:szCs w:val="21"/>
         </w:rPr>
-        <w:t xml:space="preserve">% </w:t>
-      </w:r>
-      <w:proofErr w:type="spellStart"/>
+        <w:t>{{ exp.environment }}</w:t>
+      </w:r>
+    </w:p>
+    <w:p>
+      <w:pPr>
+        <w:tabs>
+          <w:tab w:val="right" w:pos="10800"/>
+        </w:tabs>
+        <w:spacing w:after="0" w:line="240" w:lineRule="auto"/>
+        <w:ind w:left="180" w:right="-270" w:hanging="540"/>
+        <w:rPr>
+          <w:rFonts w:eastAsia="Times New Roman" w:cstheme="minorHAnsi"/>
+          <w:b/>
+          <w:bCs/>
+          <w:sz w:val="22"/>
+        </w:rPr>
+      </w:pPr>
       <w:r>
         <w:rPr>
           <w:sz w:val="21"/>
           <w:szCs w:val="21"/>
         </w:rPr>
-        <w:t>endfor</w:t>
-      </w:r>
-      <w:proofErr w:type="spellEnd"/>
-      <w:r>
-        <w:rPr>
-          <w:sz w:val="21"/>
-          <w:szCs w:val="21"/>
-        </w:rPr>
-        <w:t xml:space="preserve"> %}</w:t>
-      </w:r>
-    </w:p>
-    <w:p>
-      <w:pPr>
-        <w:spacing w:after="0" w:line="240" w:lineRule="auto"/>
-        <w:ind w:left="180" w:right="-270" w:hanging="540"/>
-        <w:rPr>
-          <w:sz w:val="21"/>
-          <w:szCs w:val="21"/>
-        </w:rPr>
-      </w:pPr>
-      <w:r>
-        <w:rPr>
-          <w:b/>
-          <w:bCs/>
-          <w:sz w:val="21"/>
-          <w:szCs w:val="21"/>
-        </w:rPr>
-        <w:t xml:space="preserve">Environment: </w:t>
-      </w:r>
-      <w:proofErr w:type="gramStart"/>
-      <w:r>
-        <w:rPr>
-          <w:sz w:val="21"/>
-          <w:szCs w:val="21"/>
-        </w:rPr>
-        <w:t xml:space="preserve">{{ </w:t>
-      </w:r>
-      <w:proofErr w:type="spellStart"/>
-      <w:r>
-        <w:rPr>
-          <w:sz w:val="21"/>
-          <w:szCs w:val="21"/>
-        </w:rPr>
-        <w:t>exp</w:t>
-      </w:r>
-      <w:proofErr w:type="gramEnd"/>
-      <w:r>
-        <w:rPr>
-          <w:sz w:val="21"/>
-          <w:szCs w:val="21"/>
-        </w:rPr>
-        <w:t>.</w:t>
-      </w:r>
-      <w:proofErr w:type="gramStart"/>
-      <w:r>
-        <w:rPr>
-          <w:sz w:val="21"/>
-          <w:szCs w:val="21"/>
-        </w:rPr>
-        <w:t>environment</w:t>
-      </w:r>
-      <w:proofErr w:type="spellEnd"/>
-      <w:r>
-        <w:rPr>
-          <w:sz w:val="21"/>
-          <w:szCs w:val="21"/>
-        </w:rPr>
-        <w:t xml:space="preserve"> }</w:t>
-      </w:r>
-      <w:proofErr w:type="gramEnd"/>
-      <w:r>
-        <w:rPr>
-          <w:sz w:val="21"/>
-          <w:szCs w:val="21"/>
-        </w:rPr>
-        <w:t>}</w:t>
-      </w:r>
-    </w:p>
-    <w:p>
-      <w:pPr>
-        <w:spacing w:after="0" w:line="240" w:lineRule="auto"/>
-        <w:ind w:left="180" w:right="-270" w:hanging="540"/>
-        <w:rPr>
-          <w:rFonts w:eastAsia="Times New Roman" w:cstheme="minorHAnsi"/>
-          <w:b/>
-          <w:bCs/>
-          <w:sz w:val="22"/>
-        </w:rPr>
-      </w:pPr>
-      <w:r>
-        <w:rPr>
-          <w:sz w:val="21"/>
-          <w:szCs w:val="21"/>
-        </w:rPr>
-        <w:t xml:space="preserve">{% </w:t>
-      </w:r>
-      <w:proofErr w:type="spellStart"/>
-      <w:r>
-        <w:rPr>
-          <w:sz w:val="21"/>
-          <w:szCs w:val="21"/>
-        </w:rPr>
-        <w:t>endfor</w:t>
-      </w:r>
-      <w:proofErr w:type="spellEnd"/>
-      <w:r>
-        <w:rPr>
-          <w:sz w:val="21"/>
-          <w:szCs w:val="21"/>
-        </w:rPr>
-        <w:t xml:space="preserve"> %}</w:t>
+        <w:t>{% endfor %}</w:t>
       </w:r>
     </w:p>
     <w:p>

</xml_diff>